<commit_message>
Atualiza documentação com as novas funcionalidades
README.md: passos de uso para seleção/exclusão e cadastro de
agendamentos e para a página 404, mais seções dedicadas explicando o
funcionamento e a limitação de não persistência. Documento explicativo
(.docx): nova seção 15 detalhando o código adicionado nas duas
funcionalidades, seguindo o mesmo formato do restante do documento.
</commit_message>
<xml_diff>
--- a/Explicacao_Projeto_Agenda_Medica.docx
+++ b/Explicacao_Projeto_Agenda_Medica.docx
@@ -10677,6 +10677,1241 @@
           <w:spacing w:val="0"/>
         </w:rPr>
         <w:t xml:space="preserve"> — Servidor WSGI de produção (Gunicorn) em vez do servidor de desenvolvimento do Flask, proteção CSRF no formulário de login, paginação na tabela de agendamentos, e testes de interface (end-to-end) além dos testes de backend.</w:t>
+      </w:r>
+    </w:p>
+    <w:p>
+      <w:pPr>
+        <w:spacing w:after="354"/>
+      </w:pPr>
+      <w:r>
+        <w:rPr>
+          <w:rFonts w:ascii="Arial" w:hAnsi="Arial"/>
+          <w:b/>
+          <w:color w:val="277E67"/>
+          <w:sz w:val="42"/>
+        </w:rPr>
+        <w:t>15. Alterações realizadas após a entrega inicial</w:t>
+      </w:r>
+    </w:p>
+    <w:p>
+      <w:pPr>
+        <w:spacing w:after="320"/>
+      </w:pPr>
+      <w:r>
+        <w:rPr>
+          <w:rFonts w:ascii="Arial" w:hAnsi="Arial"/>
+          <w:sz w:val="32"/>
+        </w:rPr>
+        <w:t>Depois da entrega inicial do desafio, o projeto recebeu duas novas funcionalidades por iniciativa própria: (1) criação e exclusão de agendamentos diretamente pela tela e (2) uma página de erro 404 personalizada para qualquer URL inexistente. As seções 1 a 14 acima descrevem o projeto como ele foi entregue originalmente; esta seção final documenta apenas o que foi acrescentado depois.</w:t>
+      </w:r>
+    </w:p>
+    <w:p>
+      <w:pPr>
+        <w:spacing w:after="354"/>
+      </w:pPr>
+      <w:r>
+        <w:rPr>
+          <w:rFonts w:ascii="Arial" w:hAnsi="Arial"/>
+          <w:b/>
+          <w:color w:val="262626"/>
+          <w:sz w:val="34"/>
+        </w:rPr>
+        <w:t>15.1 Criar e excluir agendamentos</w:t>
+      </w:r>
+    </w:p>
+    <w:p>
+      <w:pPr>
+        <w:spacing w:after="320"/>
+      </w:pPr>
+      <w:r>
+        <w:rPr>
+          <w:rFonts w:ascii="Arial" w:hAnsi="Arial"/>
+          <w:sz w:val="32"/>
+        </w:rPr>
+        <w:t xml:space="preserve">Antes, a rota </w:t>
+      </w:r>
+      <w:r>
+        <w:rPr>
+          <w:rFonts w:ascii="Courier New" w:hAnsi="Courier New"/>
+          <w:sz w:val="26"/>
+        </w:rPr>
+        <w:t>/agendamentos</w:t>
+      </w:r>
+      <w:r>
+        <w:rPr>
+          <w:rFonts w:ascii="Arial" w:hAnsi="Arial"/>
+          <w:sz w:val="32"/>
+        </w:rPr>
+        <w:t xml:space="preserve"> do serviço </w:t>
+      </w:r>
+      <w:r>
+        <w:rPr>
+          <w:rFonts w:ascii="Courier New" w:hAnsi="Courier New"/>
+          <w:sz w:val="26"/>
+        </w:rPr>
+        <w:t>api</w:t>
+      </w:r>
+      <w:r>
+        <w:rPr>
+          <w:rFonts w:ascii="Arial" w:hAnsi="Arial"/>
+          <w:sz w:val="32"/>
+        </w:rPr>
+        <w:t xml:space="preserve"> só tinha leitura (</w:t>
+      </w:r>
+      <w:r>
+        <w:rPr>
+          <w:rFonts w:ascii="Courier New" w:hAnsi="Courier New"/>
+          <w:sz w:val="26"/>
+        </w:rPr>
+        <w:t>GET</w:t>
+      </w:r>
+      <w:r>
+        <w:rPr>
+          <w:rFonts w:ascii="Arial" w:hAnsi="Arial"/>
+          <w:sz w:val="32"/>
+        </w:rPr>
+        <w:t>); não existia como criar nem apagar um agendamento, e nenhum registro tinha um identificador único. Para viabilizar a funcionalidade pedida — uma tabela com checkbox de seleção em cada linha, um botão de lixeira que exclui os agendamentos selecionados e um botão "+" que abre um formulário para cadastrar um novo agendamento — foi necessário mexer nas duas camadas Flask e na tela.</w:t>
+      </w:r>
+    </w:p>
+    <w:p>
+      <w:pPr>
+        <w:spacing w:after="354"/>
+      </w:pPr>
+      <w:r>
+        <w:rPr>
+          <w:rFonts w:ascii="Arial" w:hAnsi="Arial"/>
+          <w:b/>
+          <w:color w:val="262626"/>
+          <w:sz w:val="34"/>
+        </w:rPr>
+        <w:t>api/app.py — id e novas rotas</w:t>
+      </w:r>
+    </w:p>
+    <w:p>
+      <w:pPr>
+        <w:spacing w:after="320"/>
+      </w:pPr>
+      <w:r>
+        <w:rPr>
+          <w:rFonts w:ascii="Arial" w:hAnsi="Arial"/>
+          <w:sz w:val="32"/>
+        </w:rPr>
+        <w:t xml:space="preserve">Cada item de </w:t>
+      </w:r>
+      <w:r>
+        <w:rPr>
+          <w:rFonts w:ascii="Courier New" w:hAnsi="Courier New"/>
+          <w:sz w:val="26"/>
+        </w:rPr>
+        <w:t>AGENDAMENTOS</w:t>
+      </w:r>
+      <w:r>
+        <w:rPr>
+          <w:rFonts w:ascii="Arial" w:hAnsi="Arial"/>
+          <w:sz w:val="32"/>
+        </w:rPr>
+        <w:t xml:space="preserve"> passou a receber um campo </w:t>
+      </w:r>
+      <w:r>
+        <w:rPr>
+          <w:rFonts w:ascii="Courier New" w:hAnsi="Courier New"/>
+          <w:sz w:val="26"/>
+        </w:rPr>
+        <w:t>id</w:t>
+      </w:r>
+      <w:r>
+        <w:rPr>
+          <w:rFonts w:ascii="Arial" w:hAnsi="Arial"/>
+          <w:sz w:val="32"/>
+        </w:rPr>
+        <w:t xml:space="preserve"> (gerado com </w:t>
+      </w:r>
+      <w:r>
+        <w:rPr>
+          <w:rFonts w:ascii="Courier New" w:hAnsi="Courier New"/>
+          <w:sz w:val="26"/>
+        </w:rPr>
+        <w:t>itertools.count</w:t>
+      </w:r>
+      <w:r>
+        <w:rPr>
+          <w:rFonts w:ascii="Arial" w:hAnsi="Arial"/>
+          <w:sz w:val="32"/>
+        </w:rPr>
+        <w:t xml:space="preserve">, incremental a partir de 1), usado para identificar qual registro excluir. Foram criadas duas rotas novas na mesma URL </w:t>
+      </w:r>
+      <w:r>
+        <w:rPr>
+          <w:rFonts w:ascii="Courier New" w:hAnsi="Courier New"/>
+          <w:sz w:val="26"/>
+        </w:rPr>
+        <w:t>/agendamentos</w:t>
+      </w:r>
+      <w:r>
+        <w:rPr>
+          <w:rFonts w:ascii="Arial" w:hAnsi="Arial"/>
+          <w:sz w:val="32"/>
+        </w:rPr>
+        <w:t>, diferenciadas pelo método HTTP:</w:t>
+      </w:r>
+    </w:p>
+    <w:p>
+      <w:r>
+        <w:rPr>
+          <w:rFonts w:ascii="Courier New" w:hAnsi="Courier New"/>
+          <w:sz w:val="26"/>
+        </w:rPr>
+        <w:t>@app.route("/agendamentos", methods=["POST"])</w:t>
+      </w:r>
+    </w:p>
+    <w:p>
+      <w:r>
+        <w:rPr>
+          <w:rFonts w:ascii="Courier New" w:hAnsi="Courier New"/>
+          <w:sz w:val="26"/>
+        </w:rPr>
+        <w:t>def criar_agendamento():</w:t>
+      </w:r>
+    </w:p>
+    <w:p>
+      <w:r>
+        <w:rPr>
+          <w:rFonts w:ascii="Courier New" w:hAnsi="Courier New"/>
+          <w:sz w:val="26"/>
+        </w:rPr>
+        <w:t xml:space="preserve">    data = request.get_json(silent=True) or {}</w:t>
+      </w:r>
+    </w:p>
+    <w:p>
+      <w:r>
+        <w:rPr>
+          <w:rFonts w:ascii="Courier New" w:hAnsi="Courier New"/>
+          <w:sz w:val="26"/>
+        </w:rPr>
+        <w:t xml:space="preserve">    missing = [f for f in REQUIRED_FIELDS if not str(data.get(f, "")).strip()]</w:t>
+      </w:r>
+    </w:p>
+    <w:p>
+      <w:r>
+        <w:rPr>
+          <w:rFonts w:ascii="Courier New" w:hAnsi="Courier New"/>
+          <w:sz w:val="26"/>
+        </w:rPr>
+        <w:t xml:space="preserve">    if missing:</w:t>
+      </w:r>
+    </w:p>
+    <w:p>
+      <w:r>
+        <w:rPr>
+          <w:rFonts w:ascii="Courier New" w:hAnsi="Courier New"/>
+          <w:sz w:val="26"/>
+        </w:rPr>
+        <w:t xml:space="preserve">        return jsonify({"error": ...}), 400</w:t>
+      </w:r>
+    </w:p>
+    <w:p>
+      <w:r>
+        <w:rPr>
+          <w:rFonts w:ascii="Courier New" w:hAnsi="Courier New"/>
+          <w:sz w:val="26"/>
+        </w:rPr>
+        <w:t xml:space="preserve">    novo_agendamento = {field: data[field] for field in REQUIRED_FIELDS}</w:t>
+      </w:r>
+    </w:p>
+    <w:p>
+      <w:r>
+        <w:rPr>
+          <w:rFonts w:ascii="Courier New" w:hAnsi="Courier New"/>
+          <w:sz w:val="26"/>
+        </w:rPr>
+        <w:t xml:space="preserve">    novo_agendamento["id"] = next(_id_counter)</w:t>
+      </w:r>
+    </w:p>
+    <w:p>
+      <w:r>
+        <w:rPr>
+          <w:rFonts w:ascii="Courier New" w:hAnsi="Courier New"/>
+          <w:sz w:val="26"/>
+        </w:rPr>
+        <w:t xml:space="preserve">    AGENDAMENTOS.append(novo_agendamento)</w:t>
+      </w:r>
+    </w:p>
+    <w:p>
+      <w:r>
+        <w:rPr>
+          <w:rFonts w:ascii="Courier New" w:hAnsi="Courier New"/>
+          <w:sz w:val="26"/>
+        </w:rPr>
+        <w:t xml:space="preserve">    return jsonify(novo_agendamento), 201</w:t>
+      </w:r>
+    </w:p>
+    <w:p>
+      <w:pPr>
+        <w:spacing w:after="320"/>
+        <w:ind w:left="720"/>
+      </w:pPr>
+      <w:r>
+        <w:rPr>
+          <w:rFonts w:ascii="Arial" w:hAnsi="Arial"/>
+          <w:sz w:val="32"/>
+        </w:rPr>
+        <w:tab/>
+        <w:t>•</w:t>
+        <w:tab/>
+      </w:r>
+      <w:r>
+        <w:rPr>
+          <w:rFonts w:ascii="Arial" w:hAnsi="Arial"/>
+          <w:sz w:val="32"/>
+        </w:rPr>
+        <w:t xml:space="preserve">Recebe o corpo JSON, confere se todos os </w:t>
+      </w:r>
+      <w:r>
+        <w:rPr>
+          <w:rFonts w:ascii="Courier New" w:hAnsi="Courier New"/>
+          <w:sz w:val="26"/>
+        </w:rPr>
+        <w:t>REQUIRED_FIELDS</w:t>
+      </w:r>
+      <w:r>
+        <w:rPr>
+          <w:rFonts w:ascii="Arial" w:hAnsi="Arial"/>
+          <w:sz w:val="32"/>
+        </w:rPr>
+        <w:t xml:space="preserve"> vieram preenchidos (se faltar algum, devolve HTTP 400 com a lista de campos ausentes), monta o novo registro só com os campos esperados, atribui um </w:t>
+      </w:r>
+      <w:r>
+        <w:rPr>
+          <w:rFonts w:ascii="Courier New" w:hAnsi="Courier New"/>
+          <w:sz w:val="26"/>
+        </w:rPr>
+        <w:t>id</w:t>
+      </w:r>
+      <w:r>
+        <w:rPr>
+          <w:rFonts w:ascii="Arial" w:hAnsi="Arial"/>
+          <w:sz w:val="32"/>
+        </w:rPr>
+        <w:t xml:space="preserve"> novo e adiciona à lista </w:t>
+      </w:r>
+      <w:r>
+        <w:rPr>
+          <w:rFonts w:ascii="Courier New" w:hAnsi="Courier New"/>
+          <w:sz w:val="26"/>
+        </w:rPr>
+        <w:t>AGENDAMENTOS</w:t>
+      </w:r>
+      <w:r>
+        <w:rPr>
+          <w:rFonts w:ascii="Arial" w:hAnsi="Arial"/>
+          <w:sz w:val="32"/>
+        </w:rPr>
+        <w:t xml:space="preserve"> em memória, devolvendo o registro criado com status 201.</w:t>
+      </w:r>
+    </w:p>
+    <w:p>
+      <w:r>
+        <w:rPr>
+          <w:rFonts w:ascii="Courier New" w:hAnsi="Courier New"/>
+          <w:sz w:val="26"/>
+        </w:rPr>
+        <w:t>@app.route("/agendamentos", methods=["DELETE"])</w:t>
+      </w:r>
+    </w:p>
+    <w:p>
+      <w:r>
+        <w:rPr>
+          <w:rFonts w:ascii="Courier New" w:hAnsi="Courier New"/>
+          <w:sz w:val="26"/>
+        </w:rPr>
+        <w:t>def excluir_agendamentos():</w:t>
+      </w:r>
+    </w:p>
+    <w:p>
+      <w:r>
+        <w:rPr>
+          <w:rFonts w:ascii="Courier New" w:hAnsi="Courier New"/>
+          <w:sz w:val="26"/>
+        </w:rPr>
+        <w:t xml:space="preserve">    data = request.get_json(silent=True) or {}</w:t>
+      </w:r>
+    </w:p>
+    <w:p>
+      <w:r>
+        <w:rPr>
+          <w:rFonts w:ascii="Courier New" w:hAnsi="Courier New"/>
+          <w:sz w:val="26"/>
+        </w:rPr>
+        <w:t xml:space="preserve">    ids = data.get("ids")</w:t>
+      </w:r>
+    </w:p>
+    <w:p>
+      <w:r>
+        <w:rPr>
+          <w:rFonts w:ascii="Courier New" w:hAnsi="Courier New"/>
+          <w:sz w:val="26"/>
+        </w:rPr>
+        <w:t xml:space="preserve">    ids_set = {int(item) for item in ids}</w:t>
+      </w:r>
+    </w:p>
+    <w:p>
+      <w:r>
+        <w:rPr>
+          <w:rFonts w:ascii="Courier New" w:hAnsi="Courier New"/>
+          <w:sz w:val="26"/>
+        </w:rPr>
+        <w:t xml:space="preserve">    AGENDAMENTOS = [a for a in AGENDAMENTOS if a["id"] not in ids_set]</w:t>
+      </w:r>
+    </w:p>
+    <w:p>
+      <w:r>
+        <w:rPr>
+          <w:rFonts w:ascii="Courier New" w:hAnsi="Courier New"/>
+          <w:sz w:val="26"/>
+        </w:rPr>
+        <w:t xml:space="preserve">    return jsonify({"removed": removidos}), 200</w:t>
+      </w:r>
+    </w:p>
+    <w:p>
+      <w:pPr>
+        <w:spacing w:after="320"/>
+        <w:ind w:left="720"/>
+      </w:pPr>
+      <w:r>
+        <w:rPr>
+          <w:rFonts w:ascii="Arial" w:hAnsi="Arial"/>
+          <w:sz w:val="32"/>
+        </w:rPr>
+        <w:tab/>
+        <w:t>•</w:t>
+        <w:tab/>
+      </w:r>
+      <w:r>
+        <w:rPr>
+          <w:rFonts w:ascii="Arial" w:hAnsi="Arial"/>
+          <w:sz w:val="32"/>
+        </w:rPr>
+        <w:t xml:space="preserve">Recebe </w:t>
+      </w:r>
+      <w:r>
+        <w:rPr>
+          <w:rFonts w:ascii="Courier New" w:hAnsi="Courier New"/>
+          <w:sz w:val="26"/>
+        </w:rPr>
+        <w:t>{"ids": [...]}</w:t>
+      </w:r>
+      <w:r>
+        <w:rPr>
+          <w:rFonts w:ascii="Arial" w:hAnsi="Arial"/>
+          <w:sz w:val="32"/>
+        </w:rPr>
+        <w:t xml:space="preserve"> no corpo, valida que é uma lista não vazia de números e reconstrói </w:t>
+      </w:r>
+      <w:r>
+        <w:rPr>
+          <w:rFonts w:ascii="Courier New" w:hAnsi="Courier New"/>
+          <w:sz w:val="26"/>
+        </w:rPr>
+        <w:t>AGENDAMENTOS</w:t>
+      </w:r>
+      <w:r>
+        <w:rPr>
+          <w:rFonts w:ascii="Arial" w:hAnsi="Arial"/>
+          <w:sz w:val="32"/>
+        </w:rPr>
+        <w:t xml:space="preserve"> removendo todos os registros cujo </w:t>
+      </w:r>
+      <w:r>
+        <w:rPr>
+          <w:rFonts w:ascii="Courier New" w:hAnsi="Courier New"/>
+          <w:sz w:val="26"/>
+        </w:rPr>
+        <w:t>id</w:t>
+      </w:r>
+      <w:r>
+        <w:rPr>
+          <w:rFonts w:ascii="Arial" w:hAnsi="Arial"/>
+          <w:sz w:val="32"/>
+        </w:rPr>
+        <w:t xml:space="preserve"> está no conjunto recebido, devolvendo quantos foram removidos.</w:t>
+      </w:r>
+    </w:p>
+    <w:p>
+      <w:pPr>
+        <w:spacing w:after="354"/>
+      </w:pPr>
+      <w:r>
+        <w:rPr>
+          <w:rFonts w:ascii="Arial" w:hAnsi="Arial"/>
+          <w:b/>
+          <w:color w:val="262626"/>
+          <w:sz w:val="34"/>
+        </w:rPr>
+        <w:t>web/app.py — rotas de proxy</w:t>
+      </w:r>
+    </w:p>
+    <w:p>
+      <w:pPr>
+        <w:spacing w:after="320"/>
+      </w:pPr>
+      <w:r>
+        <w:rPr>
+          <w:rFonts w:ascii="Arial" w:hAnsi="Arial"/>
+          <w:sz w:val="32"/>
+        </w:rPr>
+        <w:t xml:space="preserve">Seguindo o mesmo padrão já usado pela rota </w:t>
+      </w:r>
+      <w:r>
+        <w:rPr>
+          <w:rFonts w:ascii="Courier New" w:hAnsi="Courier New"/>
+          <w:sz w:val="26"/>
+        </w:rPr>
+        <w:t>GET /api/agendamentos</w:t>
+      </w:r>
+      <w:r>
+        <w:rPr>
+          <w:rFonts w:ascii="Arial" w:hAnsi="Arial"/>
+          <w:sz w:val="32"/>
+        </w:rPr>
+        <w:t xml:space="preserve"> (que já existia), foram criadas </w:t>
+      </w:r>
+      <w:r>
+        <w:rPr>
+          <w:rFonts w:ascii="Courier New" w:hAnsi="Courier New"/>
+          <w:sz w:val="26"/>
+        </w:rPr>
+        <w:t>POST /api/agendamentos</w:t>
+      </w:r>
+      <w:r>
+        <w:rPr>
+          <w:rFonts w:ascii="Arial" w:hAnsi="Arial"/>
+          <w:sz w:val="32"/>
+        </w:rPr>
+        <w:t xml:space="preserve"> e </w:t>
+      </w:r>
+      <w:r>
+        <w:rPr>
+          <w:rFonts w:ascii="Courier New" w:hAnsi="Courier New"/>
+          <w:sz w:val="26"/>
+        </w:rPr>
+        <w:t>DELETE /api/agendamentos</w:t>
+      </w:r>
+      <w:r>
+        <w:rPr>
+          <w:rFonts w:ascii="Arial" w:hAnsi="Arial"/>
+          <w:sz w:val="32"/>
+        </w:rPr>
+        <w:t xml:space="preserve">. As duas repetem a validação de </w:t>
+      </w:r>
+      <w:r>
+        <w:rPr>
+          <w:rFonts w:ascii="Courier New" w:hAnsi="Courier New"/>
+          <w:sz w:val="26"/>
+        </w:rPr>
+        <w:t>REQUIRED_FIELDS</w:t>
+      </w:r>
+      <w:r>
+        <w:rPr>
+          <w:rFonts w:ascii="Arial" w:hAnsi="Arial"/>
+          <w:sz w:val="32"/>
+        </w:rPr>
+        <w:t xml:space="preserve"> (ou da lista de </w:t>
+      </w:r>
+      <w:r>
+        <w:rPr>
+          <w:rFonts w:ascii="Courier New" w:hAnsi="Courier New"/>
+          <w:sz w:val="26"/>
+        </w:rPr>
+        <w:t>ids</w:t>
+      </w:r>
+      <w:r>
+        <w:rPr>
+          <w:rFonts w:ascii="Arial" w:hAnsi="Arial"/>
+          <w:sz w:val="32"/>
+        </w:rPr>
+        <w:t xml:space="preserve">) do lado do </w:t>
+      </w:r>
+      <w:r>
+        <w:rPr>
+          <w:rFonts w:ascii="Courier New" w:hAnsi="Courier New"/>
+          <w:sz w:val="26"/>
+        </w:rPr>
+        <w:t>web</w:t>
+      </w:r>
+      <w:r>
+        <w:rPr>
+          <w:rFonts w:ascii="Arial" w:hAnsi="Arial"/>
+          <w:sz w:val="32"/>
+        </w:rPr>
+        <w:t xml:space="preserve"> antes de repassar a chamada para o serviço </w:t>
+      </w:r>
+      <w:r>
+        <w:rPr>
+          <w:rFonts w:ascii="Courier New" w:hAnsi="Courier New"/>
+          <w:sz w:val="26"/>
+        </w:rPr>
+        <w:t>api</w:t>
+      </w:r>
+      <w:r>
+        <w:rPr>
+          <w:rFonts w:ascii="Arial" w:hAnsi="Arial"/>
+          <w:sz w:val="32"/>
+        </w:rPr>
+        <w:t xml:space="preserve"> via </w:t>
+      </w:r>
+      <w:r>
+        <w:rPr>
+          <w:rFonts w:ascii="Courier New" w:hAnsi="Courier New"/>
+          <w:sz w:val="26"/>
+        </w:rPr>
+        <w:t>requests.post</w:t>
+      </w:r>
+      <w:r>
+        <w:rPr>
+          <w:rFonts w:ascii="Arial" w:hAnsi="Arial"/>
+          <w:sz w:val="32"/>
+        </w:rPr>
+        <w:t>/</w:t>
+      </w:r>
+      <w:r>
+        <w:rPr>
+          <w:rFonts w:ascii="Courier New" w:hAnsi="Courier New"/>
+          <w:sz w:val="26"/>
+        </w:rPr>
+        <w:t>requests.delete</w:t>
+      </w:r>
+      <w:r>
+        <w:rPr>
+          <w:rFonts w:ascii="Arial" w:hAnsi="Arial"/>
+          <w:sz w:val="32"/>
+        </w:rPr>
+        <w:t xml:space="preserve">, e tratam a indisponibilidade do serviço </w:t>
+      </w:r>
+      <w:r>
+        <w:rPr>
+          <w:rFonts w:ascii="Courier New" w:hAnsi="Courier New"/>
+          <w:sz w:val="26"/>
+        </w:rPr>
+        <w:t>api</w:t>
+      </w:r>
+      <w:r>
+        <w:rPr>
+          <w:rFonts w:ascii="Arial" w:hAnsi="Arial"/>
+          <w:sz w:val="32"/>
+        </w:rPr>
+        <w:t xml:space="preserve"> do mesmo jeito que a rota de leitura original: </w:t>
+      </w:r>
+      <w:r>
+        <w:rPr>
+          <w:rFonts w:ascii="Courier New" w:hAnsi="Courier New"/>
+          <w:sz w:val="26"/>
+        </w:rPr>
+        <w:t>except requests.exceptions.RequestException</w:t>
+      </w:r>
+      <w:r>
+        <w:rPr>
+          <w:rFonts w:ascii="Arial" w:hAnsi="Arial"/>
+          <w:sz w:val="32"/>
+        </w:rPr>
+        <w:t xml:space="preserve"> devolvendo HTTP 503 com uma mensagem amigável.</w:t>
+      </w:r>
+    </w:p>
+    <w:p>
+      <w:pPr>
+        <w:spacing w:after="354"/>
+      </w:pPr>
+      <w:r>
+        <w:rPr>
+          <w:rFonts w:ascii="Arial" w:hAnsi="Arial"/>
+          <w:b/>
+          <w:color w:val="262626"/>
+          <w:sz w:val="34"/>
+        </w:rPr>
+        <w:t>Front-end: agenda.html, app.js e style.css</w:t>
+      </w:r>
+    </w:p>
+    <w:p>
+      <w:pPr>
+        <w:spacing w:after="320"/>
+        <w:ind w:left="720"/>
+      </w:pPr>
+      <w:r>
+        <w:rPr>
+          <w:rFonts w:ascii="Arial" w:hAnsi="Arial"/>
+          <w:sz w:val="32"/>
+        </w:rPr>
+        <w:tab/>
+        <w:t>•</w:t>
+        <w:tab/>
+      </w:r>
+      <w:r>
+        <w:rPr>
+          <w:rFonts w:ascii="Courier New" w:hAnsi="Courier New"/>
+          <w:sz w:val="26"/>
+        </w:rPr>
+        <w:t>agenda.html</w:t>
+      </w:r>
+      <w:r>
+        <w:rPr>
+          <w:rFonts w:ascii="Arial" w:hAnsi="Arial"/>
+          <w:sz w:val="32"/>
+        </w:rPr>
+        <w:t>: uma barra de ferramentas acima da tabela com o botão de lixeira (</w:t>
+      </w:r>
+      <w:r>
+        <w:rPr>
+          <w:rFonts w:ascii="Courier New" w:hAnsi="Courier New"/>
+          <w:sz w:val="26"/>
+        </w:rPr>
+        <w:t>disabled</w:t>
+      </w:r>
+      <w:r>
+        <w:rPr>
+          <w:rFonts w:ascii="Arial" w:hAnsi="Arial"/>
+          <w:sz w:val="32"/>
+        </w:rPr>
+        <w:t xml:space="preserve"> até existir alguma linha selecionada) e o botão "+ Novo agendamento", além de um elemento </w:t>
+      </w:r>
+      <w:r>
+        <w:rPr>
+          <w:rFonts w:ascii="Courier New" w:hAnsi="Courier New"/>
+          <w:sz w:val="26"/>
+        </w:rPr>
+        <w:t>&lt;dialog&gt;</w:t>
+      </w:r>
+      <w:r>
+        <w:rPr>
+          <w:rFonts w:ascii="Arial" w:hAnsi="Arial"/>
+          <w:sz w:val="32"/>
+        </w:rPr>
+        <w:t xml:space="preserve"> escondido com o formulário de cadastro (paciente, CPF, médico, especialidade, data, horário, convênio e status).</w:t>
+      </w:r>
+    </w:p>
+    <w:p>
+      <w:pPr>
+        <w:spacing w:after="320"/>
+        <w:ind w:left="720"/>
+      </w:pPr>
+      <w:r>
+        <w:rPr>
+          <w:rFonts w:ascii="Arial" w:hAnsi="Arial"/>
+          <w:sz w:val="32"/>
+        </w:rPr>
+        <w:tab/>
+        <w:t>•</w:t>
+        <w:tab/>
+      </w:r>
+      <w:r>
+        <w:rPr>
+          <w:rFonts w:ascii="Courier New" w:hAnsi="Courier New"/>
+          <w:sz w:val="26"/>
+        </w:rPr>
+        <w:t>app.js</w:t>
+      </w:r>
+      <w:r>
+        <w:rPr>
+          <w:rFonts w:ascii="Arial" w:hAnsi="Arial"/>
+          <w:sz w:val="32"/>
+        </w:rPr>
+        <w:t>: a tabela do Tabulator ganhou uma coluna extra de checkbox (</w:t>
+      </w:r>
+      <w:r>
+        <w:rPr>
+          <w:rFonts w:ascii="Courier New" w:hAnsi="Courier New"/>
+          <w:sz w:val="26"/>
+        </w:rPr>
+        <w:t>formatter: "rowSelection"</w:t>
+      </w:r>
+      <w:r>
+        <w:rPr>
+          <w:rFonts w:ascii="Arial" w:hAnsi="Arial"/>
+          <w:sz w:val="32"/>
+        </w:rPr>
+        <w:t xml:space="preserve">). O evento </w:t>
+      </w:r>
+      <w:r>
+        <w:rPr>
+          <w:rFonts w:ascii="Courier New" w:hAnsi="Courier New"/>
+          <w:sz w:val="26"/>
+        </w:rPr>
+        <w:t>rowSelectionChanged</w:t>
+      </w:r>
+      <w:r>
+        <w:rPr>
+          <w:rFonts w:ascii="Arial" w:hAnsi="Arial"/>
+          <w:sz w:val="32"/>
+        </w:rPr>
+        <w:t xml:space="preserve"> habilita/desabilita o botão de excluir conforme a seleção. O clique na lixeira pede confirmação, junta os </w:t>
+      </w:r>
+      <w:r>
+        <w:rPr>
+          <w:rFonts w:ascii="Courier New" w:hAnsi="Courier New"/>
+          <w:sz w:val="26"/>
+        </w:rPr>
+        <w:t>id</w:t>
+      </w:r>
+      <w:r>
+        <w:rPr>
+          <w:rFonts w:ascii="Arial" w:hAnsi="Arial"/>
+          <w:sz w:val="32"/>
+        </w:rPr>
+        <w:t xml:space="preserve">s das linhas selecionadas com </w:t>
+      </w:r>
+      <w:r>
+        <w:rPr>
+          <w:rFonts w:ascii="Courier New" w:hAnsi="Courier New"/>
+          <w:sz w:val="26"/>
+        </w:rPr>
+        <w:t>table.getSelectedData()</w:t>
+      </w:r>
+      <w:r>
+        <w:rPr>
+          <w:rFonts w:ascii="Arial" w:hAnsi="Arial"/>
+          <w:sz w:val="32"/>
+        </w:rPr>
+        <w:t xml:space="preserve"> e chama </w:t>
+      </w:r>
+      <w:r>
+        <w:rPr>
+          <w:rFonts w:ascii="Courier New" w:hAnsi="Courier New"/>
+          <w:sz w:val="26"/>
+        </w:rPr>
+        <w:t>DELETE /api/agendamentos</w:t>
+      </w:r>
+      <w:r>
+        <w:rPr>
+          <w:rFonts w:ascii="Arial" w:hAnsi="Arial"/>
+          <w:sz w:val="32"/>
+        </w:rPr>
+        <w:t xml:space="preserve">. O botão "+" abre o </w:t>
+      </w:r>
+      <w:r>
+        <w:rPr>
+          <w:rFonts w:ascii="Courier New" w:hAnsi="Courier New"/>
+          <w:sz w:val="26"/>
+        </w:rPr>
+        <w:t>&lt;dialog&gt;</w:t>
+      </w:r>
+      <w:r>
+        <w:rPr>
+          <w:rFonts w:ascii="Arial" w:hAnsi="Arial"/>
+          <w:sz w:val="32"/>
+        </w:rPr>
+        <w:t xml:space="preserve"> (</w:t>
+      </w:r>
+      <w:r>
+        <w:rPr>
+          <w:rFonts w:ascii="Courier New" w:hAnsi="Courier New"/>
+          <w:sz w:val="26"/>
+        </w:rPr>
+        <w:t>modal.showModal()</w:t>
+      </w:r>
+      <w:r>
+        <w:rPr>
+          <w:rFonts w:ascii="Arial" w:hAnsi="Arial"/>
+          <w:sz w:val="32"/>
+        </w:rPr>
+        <w:t xml:space="preserve">); o envio do formulário chama </w:t>
+      </w:r>
+      <w:r>
+        <w:rPr>
+          <w:rFonts w:ascii="Courier New" w:hAnsi="Courier New"/>
+          <w:sz w:val="26"/>
+        </w:rPr>
+        <w:t>POST /api/agendamentos</w:t>
+      </w:r>
+      <w:r>
+        <w:rPr>
+          <w:rFonts w:ascii="Arial" w:hAnsi="Arial"/>
+          <w:sz w:val="32"/>
+        </w:rPr>
+        <w:t xml:space="preserve"> e, em caso de sucesso, fecha o modal e recarrega a tabela chamando </w:t>
+      </w:r>
+      <w:r>
+        <w:rPr>
+          <w:rFonts w:ascii="Courier New" w:hAnsi="Courier New"/>
+          <w:sz w:val="26"/>
+        </w:rPr>
+        <w:t>loadAgendamentos()</w:t>
+      </w:r>
+      <w:r>
+        <w:rPr>
+          <w:rFonts w:ascii="Arial" w:hAnsi="Arial"/>
+          <w:sz w:val="32"/>
+        </w:rPr>
+        <w:t xml:space="preserve"> de novo.</w:t>
+      </w:r>
+    </w:p>
+    <w:p>
+      <w:pPr>
+        <w:spacing w:after="320"/>
+        <w:ind w:left="720"/>
+      </w:pPr>
+      <w:r>
+        <w:rPr>
+          <w:rFonts w:ascii="Arial" w:hAnsi="Arial"/>
+          <w:sz w:val="32"/>
+        </w:rPr>
+        <w:tab/>
+        <w:t>•</w:t>
+        <w:tab/>
+      </w:r>
+      <w:r>
+        <w:rPr>
+          <w:rFonts w:ascii="Courier New" w:hAnsi="Courier New"/>
+          <w:sz w:val="26"/>
+        </w:rPr>
+        <w:t>style.css</w:t>
+      </w:r>
+      <w:r>
+        <w:rPr>
+          <w:rFonts w:ascii="Arial" w:hAnsi="Arial"/>
+          <w:sz w:val="32"/>
+        </w:rPr>
+        <w:t>: estilos novos para a barra de ferramentas (</w:t>
+      </w:r>
+      <w:r>
+        <w:rPr>
+          <w:rFonts w:ascii="Courier New" w:hAnsi="Courier New"/>
+          <w:sz w:val="26"/>
+        </w:rPr>
+        <w:t>.toolbar</w:t>
+      </w:r>
+      <w:r>
+        <w:rPr>
+          <w:rFonts w:ascii="Arial" w:hAnsi="Arial"/>
+          <w:sz w:val="32"/>
+        </w:rPr>
+        <w:t>), os botões com ícone (</w:t>
+      </w:r>
+      <w:r>
+        <w:rPr>
+          <w:rFonts w:ascii="Courier New" w:hAnsi="Courier New"/>
+          <w:sz w:val="26"/>
+        </w:rPr>
+        <w:t>.icon-btn</w:t>
+      </w:r>
+      <w:r>
+        <w:rPr>
+          <w:rFonts w:ascii="Arial" w:hAnsi="Arial"/>
+          <w:sz w:val="32"/>
+        </w:rPr>
+        <w:t xml:space="preserve">, com as variações </w:t>
+      </w:r>
+      <w:r>
+        <w:rPr>
+          <w:rFonts w:ascii="Courier New" w:hAnsi="Courier New"/>
+          <w:sz w:val="26"/>
+        </w:rPr>
+        <w:t>.primary</w:t>
+      </w:r>
+      <w:r>
+        <w:rPr>
+          <w:rFonts w:ascii="Arial" w:hAnsi="Arial"/>
+          <w:sz w:val="32"/>
+        </w:rPr>
+        <w:t xml:space="preserve"> e </w:t>
+      </w:r>
+      <w:r>
+        <w:rPr>
+          <w:rFonts w:ascii="Courier New" w:hAnsi="Courier New"/>
+          <w:sz w:val="26"/>
+        </w:rPr>
+        <w:t>.danger</w:t>
+      </w:r>
+      <w:r>
+        <w:rPr>
+          <w:rFonts w:ascii="Arial" w:hAnsi="Arial"/>
+          <w:sz w:val="32"/>
+        </w:rPr>
+        <w:t>) e o modal (</w:t>
+      </w:r>
+      <w:r>
+        <w:rPr>
+          <w:rFonts w:ascii="Courier New" w:hAnsi="Courier New"/>
+          <w:sz w:val="26"/>
+        </w:rPr>
+        <w:t>dialog#agendamento-modal</w:t>
+      </w:r>
+      <w:r>
+        <w:rPr>
+          <w:rFonts w:ascii="Arial" w:hAnsi="Arial"/>
+          <w:sz w:val="32"/>
+        </w:rPr>
+        <w:t xml:space="preserve"> e </w:t>
+      </w:r>
+      <w:r>
+        <w:rPr>
+          <w:rFonts w:ascii="Courier New" w:hAnsi="Courier New"/>
+          <w:sz w:val="26"/>
+        </w:rPr>
+        <w:t>.modal-actions</w:t>
+      </w:r>
+      <w:r>
+        <w:rPr>
+          <w:rFonts w:ascii="Arial" w:hAnsi="Arial"/>
+          <w:sz w:val="32"/>
+        </w:rPr>
+        <w:t>).</w:t>
+      </w:r>
+    </w:p>
+    <w:p>
+      <w:pPr>
+        <w:spacing w:after="354"/>
+      </w:pPr>
+      <w:r>
+        <w:rPr>
+          <w:rFonts w:ascii="Arial" w:hAnsi="Arial"/>
+          <w:b/>
+          <w:color w:val="262626"/>
+          <w:sz w:val="34"/>
+        </w:rPr>
+        <w:t>Limitação conhecida: agendamentos não são persistidos</w:t>
+      </w:r>
+    </w:p>
+    <w:p>
+      <w:pPr>
+        <w:spacing w:after="320"/>
+      </w:pPr>
+      <w:r>
+        <w:rPr>
+          <w:rFonts w:ascii="Arial" w:hAnsi="Arial"/>
+          <w:sz w:val="32"/>
+        </w:rPr>
+        <w:t xml:space="preserve">Diferente da tabela </w:t>
+      </w:r>
+      <w:r>
+        <w:rPr>
+          <w:rFonts w:ascii="Courier New" w:hAnsi="Courier New"/>
+          <w:sz w:val="26"/>
+        </w:rPr>
+        <w:t>users</w:t>
+      </w:r>
+      <w:r>
+        <w:rPr>
+          <w:rFonts w:ascii="Arial" w:hAnsi="Arial"/>
+          <w:sz w:val="32"/>
+        </w:rPr>
+        <w:t xml:space="preserve"> (guardada em SQLite), os agendamentos continuam em uma lista Python em memória dentro do serviço </w:t>
+      </w:r>
+      <w:r>
+        <w:rPr>
+          <w:rFonts w:ascii="Courier New" w:hAnsi="Courier New"/>
+          <w:sz w:val="26"/>
+        </w:rPr>
+        <w:t>api</w:t>
+      </w:r>
+      <w:r>
+        <w:rPr>
+          <w:rFonts w:ascii="Arial" w:hAnsi="Arial"/>
+          <w:sz w:val="32"/>
+        </w:rPr>
+        <w:t xml:space="preserve"> — a mesma abordagem já usada para os dados mockados originais. Isso significa que um agendamento criado ou excluído pela tela é perdido se o processo/container do serviço </w:t>
+      </w:r>
+      <w:r>
+        <w:rPr>
+          <w:rFonts w:ascii="Courier New" w:hAnsi="Courier New"/>
+          <w:sz w:val="26"/>
+        </w:rPr>
+        <w:t>api</w:t>
+      </w:r>
+      <w:r>
+        <w:rPr>
+          <w:rFonts w:ascii="Arial" w:hAnsi="Arial"/>
+          <w:sz w:val="32"/>
+        </w:rPr>
+        <w:t xml:space="preserve"> reiniciar. Foi uma decisão consciente para manter a mesma simplicidade do restante do projeto; para persistir entre reinícios, o próximo passo seria criar uma tabela </w:t>
+      </w:r>
+      <w:r>
+        <w:rPr>
+          <w:rFonts w:ascii="Courier New" w:hAnsi="Courier New"/>
+          <w:sz w:val="26"/>
+        </w:rPr>
+        <w:t>agendamentos</w:t>
+      </w:r>
+      <w:r>
+        <w:rPr>
+          <w:rFonts w:ascii="Arial" w:hAnsi="Arial"/>
+          <w:sz w:val="32"/>
+        </w:rPr>
+        <w:t xml:space="preserve"> no mesmo SQLite já usado para </w:t>
+      </w:r>
+      <w:r>
+        <w:rPr>
+          <w:rFonts w:ascii="Courier New" w:hAnsi="Courier New"/>
+          <w:sz w:val="26"/>
+        </w:rPr>
+        <w:t>users</w:t>
+      </w:r>
+      <w:r>
+        <w:rPr>
+          <w:rFonts w:ascii="Arial" w:hAnsi="Arial"/>
+          <w:sz w:val="32"/>
+        </w:rPr>
+        <w:t xml:space="preserve">, reaproveitando o padrão de conexão que existe em </w:t>
+      </w:r>
+      <w:r>
+        <w:rPr>
+          <w:rFonts w:ascii="Courier New" w:hAnsi="Courier New"/>
+          <w:sz w:val="26"/>
+        </w:rPr>
+        <w:t>web/db.py</w:t>
+      </w:r>
+      <w:r>
+        <w:rPr>
+          <w:rFonts w:ascii="Arial" w:hAnsi="Arial"/>
+          <w:sz w:val="32"/>
+        </w:rPr>
+        <w:t>.</w:t>
+      </w:r>
+    </w:p>
+    <w:p>
+      <w:pPr>
+        <w:spacing w:after="354"/>
+      </w:pPr>
+      <w:r>
+        <w:rPr>
+          <w:rFonts w:ascii="Arial" w:hAnsi="Arial"/>
+          <w:b/>
+          <w:color w:val="262626"/>
+          <w:sz w:val="34"/>
+        </w:rPr>
+        <w:t>15.2 Página 404 personalizada</w:t>
+      </w:r>
+    </w:p>
+    <w:p>
+      <w:pPr>
+        <w:spacing w:after="320"/>
+      </w:pPr>
+      <w:r>
+        <w:rPr>
+          <w:rFonts w:ascii="Arial" w:hAnsi="Arial"/>
+          <w:sz w:val="32"/>
+        </w:rPr>
+        <w:t>O Flask já intercepta automaticamente qualquer URL que não bate com nenhuma rota cadastrada, devolvendo um 404. Bastou registrar um "error handler" para esse código de status — não foi preciso criar uma rota "catch-all" manual nem alterar nenhuma rota existente:</w:t>
+      </w:r>
+    </w:p>
+    <w:p>
+      <w:r>
+        <w:rPr>
+          <w:rFonts w:ascii="Courier New" w:hAnsi="Courier New"/>
+          <w:sz w:val="26"/>
+        </w:rPr>
+        <w:t>@app.errorhandler(404)</w:t>
+      </w:r>
+    </w:p>
+    <w:p>
+      <w:r>
+        <w:rPr>
+          <w:rFonts w:ascii="Courier New" w:hAnsi="Courier New"/>
+          <w:sz w:val="26"/>
+        </w:rPr>
+        <w:t>def pagina_nao_encontrada(error):</w:t>
+      </w:r>
+    </w:p>
+    <w:p>
+      <w:r>
+        <w:rPr>
+          <w:rFonts w:ascii="Courier New" w:hAnsi="Courier New"/>
+          <w:sz w:val="26"/>
+        </w:rPr>
+        <w:t xml:space="preserve">    return render_template("404.html"), 404</w:t>
+      </w:r>
+    </w:p>
+    <w:p>
+      <w:pPr>
+        <w:spacing w:after="320"/>
+      </w:pPr>
+      <w:r>
+        <w:rPr>
+          <w:rFonts w:ascii="Arial" w:hAnsi="Arial"/>
+          <w:sz w:val="32"/>
+        </w:rPr>
+        <w:t xml:space="preserve">Esse handler foi registrado uma única vez em </w:t>
+      </w:r>
+      <w:r>
+        <w:rPr>
+          <w:rFonts w:ascii="Courier New" w:hAnsi="Courier New"/>
+          <w:sz w:val="26"/>
+        </w:rPr>
+        <w:t>web/app.py</w:t>
+      </w:r>
+      <w:r>
+        <w:rPr>
+          <w:rFonts w:ascii="Arial" w:hAnsi="Arial"/>
+          <w:sz w:val="32"/>
+        </w:rPr>
+        <w:t xml:space="preserve"> e vale para a aplicação inteira. O novo template </w:t>
+      </w:r>
+      <w:r>
+        <w:rPr>
+          <w:rFonts w:ascii="Courier New" w:hAnsi="Courier New"/>
+          <w:sz w:val="26"/>
+        </w:rPr>
+        <w:t>web/templates/404.html</w:t>
+      </w:r>
+      <w:r>
+        <w:rPr>
+          <w:rFonts w:ascii="Arial" w:hAnsi="Arial"/>
+          <w:sz w:val="32"/>
+        </w:rPr>
+        <w:t xml:space="preserve"> mostra uma mensagem amigável e um botão que aponta para </w:t>
+      </w:r>
+      <w:r>
+        <w:rPr>
+          <w:rFonts w:ascii="Courier New" w:hAnsi="Courier New"/>
+          <w:sz w:val="26"/>
+        </w:rPr>
+        <w:t>url_for('index')</w:t>
+      </w:r>
+      <w:r>
+        <w:rPr>
+          <w:rFonts w:ascii="Arial" w:hAnsi="Arial"/>
+          <w:sz w:val="32"/>
+        </w:rPr>
+        <w:t xml:space="preserve"> — como a rota </w:t>
+      </w:r>
+      <w:r>
+        <w:rPr>
+          <w:rFonts w:ascii="Courier New" w:hAnsi="Courier New"/>
+          <w:sz w:val="26"/>
+        </w:rPr>
+        <w:t>index()</w:t>
+      </w:r>
+      <w:r>
+        <w:rPr>
+          <w:rFonts w:ascii="Arial" w:hAnsi="Arial"/>
+          <w:sz w:val="32"/>
+        </w:rPr>
+        <w:t xml:space="preserve"> (ver seção 5, "Rota /") já decide sozinha para onde mandar o usuário (agenda se estiver logado, login se não estiver), o botão funciona certo nos dois casos sem nenhuma lógica extra. Os estilos do bloco </w:t>
+      </w:r>
+      <w:r>
+        <w:rPr>
+          <w:rFonts w:ascii="Courier New" w:hAnsi="Courier New"/>
+          <w:sz w:val="26"/>
+        </w:rPr>
+        <w:t>.not-found-container</w:t>
+      </w:r>
+      <w:r>
+        <w:rPr>
+          <w:rFonts w:ascii="Arial" w:hAnsi="Arial"/>
+          <w:sz w:val="32"/>
+        </w:rPr>
+        <w:t xml:space="preserve"> foram acrescentados em </w:t>
+      </w:r>
+      <w:r>
+        <w:rPr>
+          <w:rFonts w:ascii="Courier New" w:hAnsi="Courier New"/>
+          <w:sz w:val="26"/>
+        </w:rPr>
+        <w:t>style.css</w:t>
+      </w:r>
+      <w:r>
+        <w:rPr>
+          <w:rFonts w:ascii="Arial" w:hAnsi="Arial"/>
+          <w:sz w:val="32"/>
+        </w:rPr>
+        <w:t>, reaproveitando as cores já usadas no restante da aplicação.</w:t>
       </w:r>
     </w:p>
     <w:sectPr/>

</xml_diff>